<commit_message>
docs(event-contracts): add settlement + redeem to close the lifecycle proof
The traded 4h BTC market resolved (Finalized, Down won). Redeemed the winning
Down tokens 1:1 for collateral; losing Up tokens were worth nothing.

- README + docx: add the settle/redeem transaction row and outcome.
- methodology/settle.mjs + redeem-result.json: the settlement watcher and its
  recorded result.
</commit_message>
<xml_diff>
--- a/event-contracts/DreamDEX-Event-Contracts-Feedback.docx
+++ b/event-contracts/DreamDEX-Event-Contracts-Feedback.docx
@@ -495,6 +495,78 @@
           </w:p>
         </w:tc>
       </w:tr>
+      <w:tr>
+        <w:tc>
+          <w:tcPr>
+            <w:tcW w:type="pct" w:w="42%"/>
+            <w:tcMar>
+              <w:top w:type="dxa" w:w="70"/>
+              <w:left w:type="dxa" w:w="110"/>
+              <w:bottom w:type="dxa" w:w="70"/>
+              <w:right w:type="dxa" w:w="110"/>
+            </w:tcMar>
+          </w:tcPr>
+          <w:p>
+            <w:r>
+              <w:rPr>
+                <w:rFonts w:ascii="Calibri" w:cs="Calibri" w:eastAsia="Calibri" w:hAnsi="Calibri"/>
+                <w:b/>
+                <w:bCs/>
+                <w:color w:val="1A1A2E"/>
+                <w:sz w:val="21"/>
+                <w:szCs w:val="21"/>
+              </w:rPr>
+              <w:t xml:space="preserve">Settle → redeem winning side after resolution</w:t>
+            </w:r>
+          </w:p>
+        </w:tc>
+        <w:tc>
+          <w:tcPr>
+            <w:tcW w:type="pct" w:w="30%"/>
+            <w:tcMar>
+              <w:top w:type="dxa" w:w="70"/>
+              <w:left w:type="dxa" w:w="110"/>
+              <w:bottom w:type="dxa" w:w="70"/>
+              <w:right w:type="dxa" w:w="110"/>
+            </w:tcMar>
+          </w:tcPr>
+          <w:p>
+            <w:r>
+              <w:rPr>
+                <w:rFonts w:ascii="Calibri" w:cs="Calibri" w:eastAsia="Calibri" w:hAnsi="Calibri"/>
+                <w:b/>
+                <w:bCs/>
+                <w:color w:val="0B7A46"/>
+                <w:sz w:val="21"/>
+                <w:szCs w:val="21"/>
+              </w:rPr>
+              <w:t xml:space="preserve">Finalized, Down won; redeemed 10 Down → 10 USDC</w:t>
+            </w:r>
+          </w:p>
+        </w:tc>
+        <w:tc>
+          <w:tcPr>
+            <w:tcW w:type="pct" w:w="28%"/>
+            <w:tcMar>
+              <w:top w:type="dxa" w:w="70"/>
+              <w:left w:type="dxa" w:w="110"/>
+              <w:bottom w:type="dxa" w:w="70"/>
+              <w:right w:type="dxa" w:w="110"/>
+            </w:tcMar>
+          </w:tcPr>
+          <w:p>
+            <w:r>
+              <w:rPr>
+                <w:rFonts w:ascii="Consolas" w:cs="Consolas" w:eastAsia="Consolas" w:hAnsi="Consolas"/>
+                <w:color w:val="3A3A50"/>
+                <w:sz w:val="18"/>
+                <w:szCs w:val="18"/>
+              </w:rPr>
+              <w:t xml:space="preserve">0x4a6774…db0a</w:t>
+            </w:r>
+          </w:p>
+        </w:tc>
+      </w:tr>
     </w:tbl>
     <w:p>
       <w:pPr>
@@ -525,18 +597,38 @@
           <w:sz w:val="21"/>
           <w:szCs w:val="21"/>
         </w:rPr>
-        <w:t xml:space="preserve">'s resting ask at 0.045. </w:t>
-      </w:r>
-      <w:r>
-        <w:rPr>
-          <w:rFonts w:ascii="Calibri" w:cs="Calibri" w:eastAsia="Calibri" w:hAnsi="Calibri"/>
-          <w:b/>
-          <w:bCs/>
-          <w:color w:val="1A1A2E"/>
-          <w:sz w:val="21"/>
-          <w:szCs w:val="21"/>
-        </w:rPr>
-        <w:t xml:space="preserve">The on-chain venue is healthy.</w:t>
+        <w:t xml:space="preserve">'s resting ask at 0.045. At expiry the oracle resolved the question </w:t>
+      </w:r>
+      <w:r>
+        <w:rPr>
+          <w:rFonts w:ascii="Calibri" w:cs="Calibri" w:eastAsia="Calibri" w:hAnsi="Calibri"/>
+          <w:b/>
+          <w:bCs/>
+          <w:color w:val="1A1A2E"/>
+          <w:sz w:val="21"/>
+          <w:szCs w:val="21"/>
+        </w:rPr>
+        <w:t xml:space="preserve">false</w:t>
+      </w:r>
+      <w:r>
+        <w:rPr>
+          <w:rFonts w:ascii="Calibri" w:cs="Calibri" w:eastAsia="Calibri" w:hAnsi="Calibri"/>
+          <w:color w:val="1A1A2E"/>
+          <w:sz w:val="21"/>
+          <w:szCs w:val="21"/>
+        </w:rPr>
+        <w:t xml:space="preserve"> (BTC closed below its opening price), finalizing the market with winningOutcome 1 (Down). The winning Down tokens redeemed 1:1; the losing Up tokens were correctly worth nothing. </w:t>
+      </w:r>
+      <w:r>
+        <w:rPr>
+          <w:rFonts w:ascii="Calibri" w:cs="Calibri" w:eastAsia="Calibri" w:hAnsi="Calibri"/>
+          <w:b/>
+          <w:bCs/>
+          <w:color w:val="1A1A2E"/>
+          <w:sz w:val="21"/>
+          <w:szCs w:val="21"/>
+        </w:rPr>
+        <w:t xml:space="preserve">The full lifecycle — faucet → mint → maker → taker → settle → redeem — works end to end.</w:t>
       </w:r>
     </w:p>
     <w:p>

</xml_diff>